<commit_message>
adding figure 3 to analysis
</commit_message>
<xml_diff>
--- a/Drafting.docx
+++ b/Drafting.docx
@@ -48,53 +48,22 @@
     </w:p>
     <w:p>
       <w:r>
-        <w:t xml:space="preserve">Vaca et al. (2010) examined mortality disparities among Hispanic, non-Hispanic Black, and non-Hispanic White populations to assess whether the “Latino Epidemiologic Paradox” affected California residents. The paradox describes a pattern in which Hispanic populations have comparatively favorable health outcomes despite socioeconomic conditions that are typically associated with poorer health, such as higher poverty rates, lower educational attainment, and reduced access to healthcare. </w:t>
-      </w:r>
-      <w:r>
-        <w:t xml:space="preserve">Using mortality data from California residents between 1999 and 2006, they found that this pattern persisted, with differences driven largely by homicide and motor vehicle crash mortality. </w:t>
-      </w:r>
-      <w:r>
-        <w:t xml:space="preserve">They also noted that mortality disparities </w:t>
-      </w:r>
-      <w:r>
-        <w:t>among</w:t>
-      </w:r>
-      <w:r>
-        <w:t xml:space="preserve"> Hispanic adolescent males </w:t>
-      </w:r>
-      <w:r>
-        <w:t>were increasing</w:t>
-      </w:r>
-      <w:r>
-        <w:t xml:space="preserve">. </w:t>
-      </w:r>
-      <w:r>
-        <w:t>The present study replicates the analytic approach of Vaca et al. using more recent data (2007-2020) to reassess the extent and relevance of these disparities.</w:t>
-      </w:r>
-      <w:r>
-        <w:t xml:space="preserve"> </w:t>
-      </w:r>
-      <w:r>
-        <w:t xml:space="preserve"> </w:t>
-      </w:r>
-    </w:p>
-    <w:p>
-      <w:pPr>
-        <w:pStyle w:val="Heading1"/>
-      </w:pPr>
-      <w:r>
-        <w:t xml:space="preserve">Methods </w:t>
-      </w:r>
-    </w:p>
-    <w:p>
-      <w:r>
-        <w:t>Mortality data were obtained from the National Center for Health Statistics (NCHS) Multiple Cause of Death files, accessed through the CDC WONDER online database.</w:t>
+        <w:t xml:space="preserve">Vaca et al. (2010) </w:t>
+      </w:r>
+      <w:r>
+        <w:t xml:space="preserve">analyzed California mortality data (1999-2006) to evaluate whether </w:t>
+      </w:r>
+      <w:r>
+        <w:t>the Latino</w:t>
+      </w:r>
+      <w:r>
+        <w:t xml:space="preserve"> Adolescent Male Mortality Peak (LAMMP),</w:t>
       </w:r>
       <w:r>
         <w:fldChar w:fldCharType="begin"/>
       </w:r>
       <w:r>
-        <w:instrText xml:space="preserve"> ADDIN ZOTERO_ITEM CSL_CITATION {"citationID":"1WkAVMc7","properties":{"formattedCitation":"\\super 1\\nosupersub{}","plainCitation":"1","noteIndex":0},"citationItems":[{"id":1623,"uris":["http://zotero.org/groups/5890901/items/MFI34KCC"],"itemData":{"id":1623,"type":"dataset","title":"Multiple Cause of Death 1999-2020 on CDC WONDER Online Database","URL":"http://wonder.cdc.gov/mcd-icd10.html","author":[{"family":"National Center for Health Statistics (NCHS)","given":""}],"accessed":{"date-parts":[["2026",1,28]]},"issued":{"date-parts":[["2021"]]}}}],"schema":"https://github.com/citation-style-language/schema/raw/master/csl-citation.json"} </w:instrText>
+        <w:instrText xml:space="preserve"> ADDIN ZOTERO_ITEM CSL_CITATION {"citationID":"DTOk9Qiz","properties":{"formattedCitation":"\\super 1\\nosupersub{}","plainCitation":"1","noteIndex":0},"citationItems":[{"id":1637,"uris":["http://zotero.org/groups/5890901/items/TFRJ628F"],"itemData":{"id":1637,"type":"article-journal","abstract":"OBJECTIVE: To describe the anomaly of the Latino adolescent male mortality peak in relation to the overall Latino epidemiological paradox and in relation to the need for new conceptual models describing the health of a culturally diverse population.\nDESIGN: Population-based study using California's 1989 to 1997 summary death files for death-related information and the State of California Department of Finance population estimates for population denominators for corresponding years.\nPARTICIPANTS: California's general population for 1989 to 1997, including California's 15- to 19-year-old and 20- to 24-year-old populations. In 1997, those 2 age groups numbered 4.3 million.\nMAIN OUTCOME MEASURES: Mortality rates for Latinos and African Americans compared with non-Hispanic whites expressed as relative risk (RR).\nRESULTS: Overall, the Latino RR of mortality follows the Latino epidemiological paradox in that it is lower (RR, &lt;1.00) than that of non-Hispanic whites for most age groups and both sexes. The anomaly within this paradox is seen in Latino males aged 15 to 19 years (RR, 1.77; 95% confidence interval, 1.55-2.02) and 20 to 24 years (RR, 1.79; 95% confidence interval, 1.58-2.02).\nCONCLUSIONS: This period of elevated mortality risk is labeled the Latino adolescent male mortality peak, and it is an anomaly within the overall Latino epidemiological paradox.","container-title":"Archives of Pediatrics &amp; Adolescent Medicine","DOI":"10.1001/archpedi.156.5.480","ISSN":"1072-4710","issue":"5","journalAbbreviation":"Arch Pediatr Adolesc Med","language":"eng","page":"480-484","PMID":"11980554","source":"PubMed","title":"An anomaly within the Latino epidemiological paradox: the Latino adolescent male mortality peak","title-short":"An anomaly within the Latino epidemiological paradox","volume":"156","author":[{"family":"Hayes-Bautista","given":"David E."},{"family":"Hsu","given":"Paul"},{"family":"Hayes-Bautista","given":"Maria"},{"family":"Iñiguez","given":"Delmy"},{"family":"Chamberlin","given":"Cynthia L."},{"family":"Rico","given":"Christian"},{"family":"Solorio","given":"Rosa"}],"issued":{"date-parts":[["2002",5]]}}}],"schema":"https://github.com/citation-style-language/schema/raw/master/csl-citation.json"} </w:instrText>
       </w:r>
       <w:r>
         <w:fldChar w:fldCharType="separate"/>
@@ -111,13 +80,28 @@
         <w:fldChar w:fldCharType="end"/>
       </w:r>
       <w:r>
-        <w:t xml:space="preserve"> Analyses were restricted to deaths occurring among California residents from 2007 through 2020. Race and ethnicity categories were defined using NCHS classifications.</w:t>
+        <w:t xml:space="preserve"> a previously identified anomaly to the Hispanic Paradox, persisted across racial and ethnic groups. The Hispanic Paradox</w:t>
+      </w:r>
+      <w:r>
+        <w:t>, also known as the Latino Epidemiologic Paradox,</w:t>
+      </w:r>
+      <w:r>
+        <w:t xml:space="preserve"> </w:t>
+      </w:r>
+      <w:r>
+        <w:t xml:space="preserve">describes a pattern in which Hispanic populations </w:t>
+      </w:r>
+      <w:r>
+        <w:t>experience</w:t>
+      </w:r>
+      <w:r>
+        <w:t xml:space="preserve"> comparatively favorable health outcomes despite socioeconomic conditions typically associated with poorer health, such as higher poverty rates, lower educational attainment, and reduced access to healthcare.</w:t>
       </w:r>
       <w:r>
         <w:fldChar w:fldCharType="begin"/>
       </w:r>
       <w:r>
-        <w:instrText xml:space="preserve"> ADDIN ZOTERO_ITEM CSL_CITATION {"citationID":"38fvPxK7","properties":{"formattedCitation":"\\super 2\\nosupersub{}","plainCitation":"2","noteIndex":0},"citationItems":[{"id":1631,"uris":["http://zotero.org/groups/5890901/items/6C8MDFGA"],"itemData":{"id":1631,"type":"webpage","language":"en-us","publisher":"Centers for Disease Control and Prevention (CDC)","title":"Race","URL":"https://www.cdc.gov/nchs/hus/sources-definitions/race.html","author":[{"family":"National Center for Health Statistics (NCHS)","given":""}],"accessed":{"date-parts":[["2026",2,20]]},"issued":{"date-parts":[["2025",6,6]]}}}],"schema":"https://github.com/citation-style-language/schema/raw/master/csl-citation.json"} </w:instrText>
+        <w:instrText xml:space="preserve"> ADDIN ZOTERO_ITEM CSL_CITATION {"citationID":"LMSsPCM7","properties":{"formattedCitation":"\\super 2\\nosupersub{}","plainCitation":"2","noteIndex":0},"citationItems":[{"id":1635,"uris":["http://zotero.org/groups/5890901/items/Y3ILV23C"],"itemData":{"id":1635,"type":"article-journal","abstract":"Recent reports in the literature on the health status of southwestern Hispanics, most of whom are Mexican Americans, are reviewed critically. The review is organized into the following sections: infant mortality, mortality at other ages, cardiovascular diseases, cancer, diabetes, other diseases, interview data on physical health, and mental health. Despite methodological limitations of much of the research, it can be concluded with some certainty that the health status of Hispanics in the Southwest is much more similar to the health status of other whites than that of blacks although socioeconomically, the status of Hispanics is closer to that of blacks. This observation is supported by evidence on such key health indicators as infant mortality, life-expectancy, mortality from cardiovascular diseases, mortality from major types of cancer, and measures of functional health. On other health indicators, such as diabetes and infectious and parasitic diseases, Hispanics appear to be clearly disadvantaged relative to other whites. Factors explaining the relative advantages or disadvantages of Hispanics include cultural practices, family supports, selective migration, diet, and genetic heritage. The recently completed Hispanic Health and Nutrition Examination Survey will go a long way to provide answers to many questions regarding the health of Hispanics in the Southwest or elsewhere.","container-title":"Public Health Reports","ISSN":"0033-3549","issue":"3","journalAbbreviation":"Public Health Rep","page":"253-265","PMID":"3086917","PMCID":"PMC1477704","source":"PubMed Central","title":"The health of Hispanics in the southwestern United States: an epidemiologic paradox.","title-short":"The health of Hispanics in the southwestern United States","volume":"101","author":[{"family":"Markides","given":"K S"},{"family":"Coreil","given":"J"}],"issued":{"date-parts":[["1986"]]}}}],"schema":"https://github.com/citation-style-language/schema/raw/master/csl-citation.json"} </w:instrText>
       </w:r>
       <w:r>
         <w:fldChar w:fldCharType="separate"/>
@@ -134,22 +118,16 @@
         <w:fldChar w:fldCharType="end"/>
       </w:r>
       <w:r>
-        <w:t xml:space="preserve"> Individuals classified as Hispanic were those identified as being of </w:t>
-      </w:r>
-      <w:r>
-        <w:t>Cuban, Mexican, Puerto Rican, South or Central American, or Spanish origin</w:t>
-      </w:r>
-      <w:r>
-        <w:t>, regardless of race, consistent with U.S. Census definitions</w:t>
-      </w:r>
-      <w:r>
-        <w:t>.</w:t>
+        <w:t xml:space="preserve"> </w:t>
+      </w:r>
+      <w:r>
+        <w:t>In contrast to this overall pattern, Hayes-Bautista et al. identified the LAMMP in earlier California data from 1989 to 1997 and found that Latino adolescent and young adult males had elevated mortality rates largely driven by motor vehicle crash and homicide deaths.</w:t>
       </w:r>
       <w:r>
         <w:fldChar w:fldCharType="begin"/>
       </w:r>
       <w:r>
-        <w:instrText xml:space="preserve"> ADDIN ZOTERO_ITEM CSL_CITATION {"citationID":"HJPaQE2i","properties":{"formattedCitation":"\\super 3\\nosupersub{}","plainCitation":"3","noteIndex":0},"citationItems":[{"id":1633,"uris":["http://zotero.org/groups/5890901/items/JIVMQQUB"],"itemData":{"id":1633,"type":"webpage","abstract":"We ask a question about whether a person is of Hispanic, Latino, or Spanish origin to create statistics about this ethnic group.","container-title":"Census.gov","note":"section: Government","title":"Hispanic or Latino Origin","URL":"https://www.census.gov/programs-surveys/acs/","author":[{"family":"Bureau","given":"US Census"}],"accessed":{"date-parts":[["2026",2,20]]}}}],"schema":"https://github.com/citation-style-language/schema/raw/master/csl-citation.json"} </w:instrText>
+        <w:instrText xml:space="preserve"> ADDIN ZOTERO_ITEM CSL_CITATION {"citationID":"HsWH3g96","properties":{"formattedCitation":"\\super 1\\nosupersub{}","plainCitation":"1","noteIndex":0},"citationItems":[{"id":1637,"uris":["http://zotero.org/groups/5890901/items/TFRJ628F"],"itemData":{"id":1637,"type":"article-journal","abstract":"OBJECTIVE: To describe the anomaly of the Latino adolescent male mortality peak in relation to the overall Latino epidemiological paradox and in relation to the need for new conceptual models describing the health of a culturally diverse population.\nDESIGN: Population-based study using California's 1989 to 1997 summary death files for death-related information and the State of California Department of Finance population estimates for population denominators for corresponding years.\nPARTICIPANTS: California's general population for 1989 to 1997, including California's 15- to 19-year-old and 20- to 24-year-old populations. In 1997, those 2 age groups numbered 4.3 million.\nMAIN OUTCOME MEASURES: Mortality rates for Latinos and African Americans compared with non-Hispanic whites expressed as relative risk (RR).\nRESULTS: Overall, the Latino RR of mortality follows the Latino epidemiological paradox in that it is lower (RR, &lt;1.00) than that of non-Hispanic whites for most age groups and both sexes. The anomaly within this paradox is seen in Latino males aged 15 to 19 years (RR, 1.77; 95% confidence interval, 1.55-2.02) and 20 to 24 years (RR, 1.79; 95% confidence interval, 1.58-2.02).\nCONCLUSIONS: This period of elevated mortality risk is labeled the Latino adolescent male mortality peak, and it is an anomaly within the overall Latino epidemiological paradox.","container-title":"Archives of Pediatrics &amp; Adolescent Medicine","DOI":"10.1001/archpedi.156.5.480","ISSN":"1072-4710","issue":"5","journalAbbreviation":"Arch Pediatr Adolesc Med","language":"eng","page":"480-484","PMID":"11980554","source":"PubMed","title":"An anomaly within the Latino epidemiological paradox: the Latino adolescent male mortality peak","title-short":"An anomaly within the Latino epidemiological paradox","volume":"156","author":[{"family":"Hayes-Bautista","given":"David E."},{"family":"Hsu","given":"Paul"},{"family":"Hayes-Bautista","given":"Maria"},{"family":"Iñiguez","given":"Delmy"},{"family":"Chamberlin","given":"Cynthia L."},{"family":"Rico","given":"Christian"},{"family":"Solorio","given":"Rosa"}],"issued":{"date-parts":[["2002",5]]}}}],"schema":"https://github.com/citation-style-language/schema/raw/master/csl-citation.json"} </w:instrText>
       </w:r>
       <w:r>
         <w:fldChar w:fldCharType="separate"/>
@@ -160,7 +138,7 @@
           <w:szCs w:val="24"/>
           <w:vertAlign w:val="superscript"/>
         </w:rPr>
-        <w:t>3</w:t>
+        <w:t>1</w:t>
       </w:r>
       <w:r>
         <w:fldChar w:fldCharType="end"/>
@@ -169,18 +147,28 @@
         <w:t xml:space="preserve"> </w:t>
       </w:r>
       <w:r>
-        <w:t>Mortality data were queried separately by cause of death</w:t>
-      </w:r>
-      <w:r>
-        <w:t xml:space="preserve"> and </w:t>
-      </w:r>
-      <w:r>
-        <w:t>racial/ethnic group because the database does not permit simultaneous extraction of Hispanic and non-Hispanic categories.</w:t>
-      </w:r>
-    </w:p>
-    <w:p>
-      <w:r>
-        <w:t>The CDC WONDER query system suppresses mortality counts fewer than 10 to protect confidentiality</w:t>
+        <w:t xml:space="preserve">Vaca et al. found that the LAMMP </w:t>
+      </w:r>
+      <w:r>
+        <w:t>persisted</w:t>
+      </w:r>
+      <w:r>
+        <w:t xml:space="preserve"> in California through 2006, also noting</w:t>
+      </w:r>
+      <w:r>
+        <w:t xml:space="preserve"> </w:t>
+      </w:r>
+      <w:r>
+        <w:t xml:space="preserve">that mortality disparities </w:t>
+      </w:r>
+      <w:r>
+        <w:t>among</w:t>
+      </w:r>
+      <w:r>
+        <w:t xml:space="preserve"> Hispanic adolescent males </w:t>
+      </w:r>
+      <w:r>
+        <w:t>were increasing</w:t>
       </w:r>
       <w:r>
         <w:t>.</w:t>
@@ -189,7 +177,7 @@
         <w:fldChar w:fldCharType="begin"/>
       </w:r>
       <w:r>
-        <w:instrText xml:space="preserve"> ADDIN ZOTERO_ITEM CSL_CITATION {"citationID":"7qMyCd1p","properties":{"formattedCitation":"\\super 1\\nosupersub{}","plainCitation":"1","noteIndex":0},"citationItems":[{"id":1623,"uris":["http://zotero.org/groups/5890901/items/MFI34KCC"],"itemData":{"id":1623,"type":"dataset","title":"Multiple Cause of Death 1999-2020 on CDC WONDER Online Database","URL":"http://wonder.cdc.gov/mcd-icd10.html","author":[{"family":"National Center for Health Statistics (NCHS)","given":""}],"accessed":{"date-parts":[["2026",1,28]]},"issued":{"date-parts":[["2021"]]}}}],"schema":"https://github.com/citation-style-language/schema/raw/master/csl-citation.json"} </w:instrText>
+        <w:instrText xml:space="preserve"> ADDIN ZOTERO_ITEM CSL_CITATION {"citationID":"jRFdn0vB","properties":{"formattedCitation":"\\super 3\\nosupersub{}","plainCitation":"3","noteIndex":0},"citationItems":[{"id":1639,"uris":["http://zotero.org/groups/5890901/items/XPDULYK7"],"itemData":{"id":1639,"type":"article-journal","abstract":"OBJECTIVE\nThe Latino Epidemiologic Paradox describes favorable health profiles for Latinos compared to non-Latino Whites despite poverty, low education, and low access to health care. Our study objective was to determine if the anomaly to the Latino Epidemiological Paradox and the Latino Adolescent Male Mortality Peak in California mortality data persists.\n\nMETHODS\nCases were California residents (1999–2006) of any race and ethnicity that died (N = 1,866,743) in California from any cause of death. Mortality rates and rate ratios were calculated according to causes of death for 5 year age groups.\n\nRESULTS\nFor males and females combined, age-adjusted mortality rates were 509 for Latinos and 681 for non-Latino Whites per 100,000/yr. Latino male mortality rate ratios exceeded 1.0 compared to non-Latino White males only for 15–19 yrs (1.41 95%CI 1.35–1.49) and 20–24 yrs (1.24 95%CI 1.19–1.29). Latinas had lower mortality rates than non-Latino White females for all ages over 15 years. Male homicide rates for Latinos increased over the study period, but did not reach the rates reported for the years 1989–1997. Both male homicide and motor vehicle crash mortality rates were higher for Latinos than non-Latino Whites and peaked at 20–24 yrs. Latino crash mortality rate exceeded the rate for non-Latino Whites overall and for each year 2003–2006. Crash mortality for males 15–24 yrs increased from 2000–2006.\n\nCONCLUSION\nThe anomaly and the mortality peak persist with notable attribution to homicide and crashes. Without homicide, the mortality peak would not exist. Mortality disparities for Latino adolescent males from these two causes of death in California appear to be growing.","container-title":"Injury prevention : journal of the International Society for Child and Adolescent Injury Prevention","DOI":"10.1136/ip.2010.028886","ISSN":"1353-8047","issue":"2","journalAbbreviation":"Inj Prev","page":"102-107","PMID":"21134905","PMCID":"PMC3065499","source":"PubMed Central","title":"THE LATINO ADOLESCENT MALE MORTALITY PEAK REVISITED: ATTRIBUTION OF HOMICIDE AND MOTOR VEHICLE CRASH FATALITY","title-short":"THE LATINO ADOLESCENT MALE MORTALITY PEAK REVISITED","volume":"17","author":[{"family":"Vaca","given":"Federico E."},{"family":"Anderson","given":"Craig L."},{"family":"Hayes-Bautista","given":"David E."}],"issued":{"date-parts":[["2011",4]]}}}],"schema":"https://github.com/citation-style-language/schema/raw/master/csl-citation.json"} </w:instrText>
       </w:r>
       <w:r>
         <w:fldChar w:fldCharType="separate"/>
@@ -200,7 +188,7 @@
           <w:szCs w:val="24"/>
           <w:vertAlign w:val="superscript"/>
         </w:rPr>
-        <w:t>1</w:t>
+        <w:t>3</w:t>
       </w:r>
       <w:r>
         <w:fldChar w:fldCharType="end"/>
@@ -209,13 +197,13 @@
         <w:t xml:space="preserve"> </w:t>
       </w:r>
       <w:r>
-        <w:t xml:space="preserve">Because data were extracted annually and stratified by </w:t>
-      </w:r>
-      <w:r>
-        <w:t>5-year-</w:t>
-      </w:r>
-      <w:r>
-        <w:t>age group and race/ethnicity, some cells corresponding to small population subgroups may not have been reported and therefore are absent from the dataset. Consequently, counts for certain strata may be underestimated.</w:t>
+        <w:t xml:space="preserve">The present study replicates the analytic approach of Vaca et al. using more recent data (2007-2020) to reassess </w:t>
+      </w:r>
+      <w:r>
+        <w:t>whether these patterns persist</w:t>
+      </w:r>
+      <w:r>
+        <w:t>.</w:t>
       </w:r>
       <w:r>
         <w:t xml:space="preserve"> </w:t>
@@ -225,14 +213,22 @@
       </w:r>
     </w:p>
     <w:p>
-      <w:r>
-        <w:t>Annual population estimates by age, sex, race and ethnicity were obtained from the California Department of Finance-Demographic Research Unit (DOF).</w:t>
+      <w:pPr>
+        <w:pStyle w:val="Heading1"/>
+      </w:pPr>
+      <w:r>
+        <w:t xml:space="preserve">Methods </w:t>
+      </w:r>
+    </w:p>
+    <w:p>
+      <w:r>
+        <w:t>Mortality data were obtained from the National Center for Health Statistics (NCHS) Multiple Cause of Death files, accessed through the CDC WONDER online database.</w:t>
       </w:r>
       <w:r>
         <w:fldChar w:fldCharType="begin"/>
       </w:r>
       <w:r>
-        <w:instrText xml:space="preserve"> ADDIN ZOTERO_ITEM CSL_CITATION {"citationID":"Q7AtsFzI","properties":{"formattedCitation":"\\super 4,5\\nosupersub{}","plainCitation":"4,5","noteIndex":0},"citationItems":[{"id":1629,"uris":["http://zotero.org/groups/5890901/items/QIICLCBB"],"itemData":{"id":1629,"type":"webpage","title":"Annual Intercensal Population Estimates by Race/Ethnicity with Age and Gender Detail 2000–2010 | California Department of Finance","URL":"https://dof.ca.gov/forecasting/demographics/estimates/annual-intercensal-population-estimates-by-race-ethnicity-with-age-and-gender-detail/","accessed":{"date-parts":[["2026",2,19]]}}},{"id":1627,"uris":["http://zotero.org/groups/5890901/items/CI2DVIZH"],"itemData":{"id":1627,"type":"webpage","title":"Annual Intercensal Population Estimates by Race/Ethnicity with Age and Gender Detail 2010-2020 | California Department of Finance","URL":"https://dof.ca.gov/forecasting/demographics/estimates/annual-intercensal-population-estimates-by-race-ethnicity-with-age-and-gender-detail-2010-2020/","accessed":{"date-parts":[["2026",2,19]]}}}],"schema":"https://github.com/citation-style-language/schema/raw/master/csl-citation.json"} </w:instrText>
+        <w:instrText xml:space="preserve"> ADDIN ZOTERO_ITEM CSL_CITATION {"citationID":"1WkAVMc7","properties":{"formattedCitation":"\\super 4\\nosupersub{}","plainCitation":"4","noteIndex":0},"citationItems":[{"id":1623,"uris":["http://zotero.org/groups/5890901/items/MFI34KCC"],"itemData":{"id":1623,"type":"dataset","title":"Multiple Cause of Death 1999-2020 on CDC WONDER Online Database","URL":"http://wonder.cdc.gov/mcd-icd10.html","author":[{"family":"National Center for Health Statistics (NCHS)","given":""}],"accessed":{"date-parts":[["2026",1,28]]},"issued":{"date-parts":[["2021"]]}}}],"schema":"https://github.com/citation-style-language/schema/raw/master/csl-citation.json"} </w:instrText>
       </w:r>
       <w:r>
         <w:fldChar w:fldCharType="separate"/>
@@ -243,22 +239,19 @@
           <w:szCs w:val="24"/>
           <w:vertAlign w:val="superscript"/>
         </w:rPr>
-        <w:t>4,5</w:t>
+        <w:t>4</w:t>
       </w:r>
       <w:r>
         <w:fldChar w:fldCharType="end"/>
       </w:r>
       <w:r>
-        <w:t xml:space="preserve"> </w:t>
-      </w:r>
-      <w:r>
-        <w:t>These population estimates are based on intercensal demographic projections for 2000-2010</w:t>
+        <w:t xml:space="preserve"> Analyses were restricted to deaths occurring among California residents from 2007 through 2020. Race and ethnicity categories were defined using NCHS classifications.</w:t>
       </w:r>
       <w:r>
         <w:fldChar w:fldCharType="begin"/>
       </w:r>
       <w:r>
-        <w:instrText xml:space="preserve"> ADDIN ZOTERO_ITEM CSL_CITATION {"citationID":"jaI41rqV","properties":{"formattedCitation":"\\super 4\\nosupersub{}","plainCitation":"4","noteIndex":0},"citationItems":[{"id":1629,"uris":["http://zotero.org/groups/5890901/items/QIICLCBB"],"itemData":{"id":1629,"type":"webpage","title":"Annual Intercensal Population Estimates by Race/Ethnicity with Age and Gender Detail 2000–2010 | California Department of Finance","URL":"https://dof.ca.gov/forecasting/demographics/estimates/annual-intercensal-population-estimates-by-race-ethnicity-with-age-and-gender-detail/","accessed":{"date-parts":[["2026",2,19]]}}}],"schema":"https://github.com/citation-style-language/schema/raw/master/csl-citation.json"} </w:instrText>
+        <w:instrText xml:space="preserve"> ADDIN ZOTERO_ITEM CSL_CITATION {"citationID":"38fvPxK7","properties":{"formattedCitation":"\\super 5\\nosupersub{}","plainCitation":"5","noteIndex":0},"citationItems":[{"id":1631,"uris":["http://zotero.org/groups/5890901/items/6C8MDFGA"],"itemData":{"id":1631,"type":"webpage","language":"en-us","publisher":"Centers for Disease Control and Prevention (CDC)","title":"Race","URL":"https://www.cdc.gov/nchs/hus/sources-definitions/race.html","author":[{"family":"National Center for Health Statistics (NCHS)","given":""}],"accessed":{"date-parts":[["2026",2,20]]},"issued":{"date-parts":[["2025",6,6]]}}}],"schema":"https://github.com/citation-style-language/schema/raw/master/csl-citation.json"} </w:instrText>
       </w:r>
       <w:r>
         <w:fldChar w:fldCharType="separate"/>
@@ -269,19 +262,28 @@
           <w:szCs w:val="24"/>
           <w:vertAlign w:val="superscript"/>
         </w:rPr>
-        <w:t>4</w:t>
+        <w:t>5</w:t>
       </w:r>
       <w:r>
         <w:fldChar w:fldCharType="end"/>
       </w:r>
       <w:r>
-        <w:t xml:space="preserve"> and 2010-2020.</w:t>
+        <w:t xml:space="preserve"> Individuals classified as Hispanic were those identified as being of </w:t>
+      </w:r>
+      <w:r>
+        <w:t>Cuban, Mexican, Puerto Rican, South or Central American, or Spanish origin</w:t>
+      </w:r>
+      <w:r>
+        <w:t>, regardless of race, consistent with U.S. Census definitions</w:t>
+      </w:r>
+      <w:r>
+        <w:t>.</w:t>
       </w:r>
       <w:r>
         <w:fldChar w:fldCharType="begin"/>
       </w:r>
       <w:r>
-        <w:instrText xml:space="preserve"> ADDIN ZOTERO_ITEM CSL_CITATION {"citationID":"IhUqySzu","properties":{"formattedCitation":"\\super 5\\nosupersub{}","plainCitation":"5","noteIndex":0},"citationItems":[{"id":1627,"uris":["http://zotero.org/groups/5890901/items/CI2DVIZH"],"itemData":{"id":1627,"type":"webpage","title":"Annual Intercensal Population Estimates by Race/Ethnicity with Age and Gender Detail 2010-2020 | California Department of Finance","URL":"https://dof.ca.gov/forecasting/demographics/estimates/annual-intercensal-population-estimates-by-race-ethnicity-with-age-and-gender-detail-2010-2020/","accessed":{"date-parts":[["2026",2,19]]}}}],"schema":"https://github.com/citation-style-language/schema/raw/master/csl-citation.json"} </w:instrText>
+        <w:instrText xml:space="preserve"> ADDIN ZOTERO_ITEM CSL_CITATION {"citationID":"HJPaQE2i","properties":{"formattedCitation":"\\super 6\\nosupersub{}","plainCitation":"6","noteIndex":0},"citationItems":[{"id":1633,"uris":["http://zotero.org/groups/5890901/items/JIVMQQUB"],"itemData":{"id":1633,"type":"webpage","abstract":"We ask a question about whether a person is of Hispanic, Latino, or Spanish origin to create statistics about this ethnic group.","container-title":"Census.gov","note":"section: Government","title":"Hispanic or Latino Origin","URL":"https://www.census.gov/programs-surveys/acs/","author":[{"family":"Bureau","given":"US Census"}],"accessed":{"date-parts":[["2026",2,20]]}}}],"schema":"https://github.com/citation-style-language/schema/raw/master/csl-citation.json"} </w:instrText>
       </w:r>
       <w:r>
         <w:fldChar w:fldCharType="separate"/>
@@ -292,7 +294,139 @@
           <w:szCs w:val="24"/>
           <w:vertAlign w:val="superscript"/>
         </w:rPr>
-        <w:t>5</w:t>
+        <w:t>6</w:t>
+      </w:r>
+      <w:r>
+        <w:fldChar w:fldCharType="end"/>
+      </w:r>
+      <w:r>
+        <w:t xml:space="preserve"> </w:t>
+      </w:r>
+      <w:r>
+        <w:t>Mortality data were queried separately by cause of death</w:t>
+      </w:r>
+      <w:r>
+        <w:t xml:space="preserve"> and </w:t>
+      </w:r>
+      <w:r>
+        <w:t>racial/ethnic group because the database does not permit simultaneous extraction of Hispanic and non-Hispanic categories.</w:t>
+      </w:r>
+    </w:p>
+    <w:p>
+      <w:r>
+        <w:t>The CDC WONDER query system suppresses mortality counts fewer than 10 to protect confidentiality</w:t>
+      </w:r>
+      <w:r>
+        <w:t>.</w:t>
+      </w:r>
+      <w:r>
+        <w:fldChar w:fldCharType="begin"/>
+      </w:r>
+      <w:r>
+        <w:instrText xml:space="preserve"> ADDIN ZOTERO_ITEM CSL_CITATION {"citationID":"7qMyCd1p","properties":{"formattedCitation":"\\super 4\\nosupersub{}","plainCitation":"4","noteIndex":0},"citationItems":[{"id":1623,"uris":["http://zotero.org/groups/5890901/items/MFI34KCC"],"itemData":{"id":1623,"type":"dataset","title":"Multiple Cause of Death 1999-2020 on CDC WONDER Online Database","URL":"http://wonder.cdc.gov/mcd-icd10.html","author":[{"family":"National Center for Health Statistics (NCHS)","given":""}],"accessed":{"date-parts":[["2026",1,28]]},"issued":{"date-parts":[["2021"]]}}}],"schema":"https://github.com/citation-style-language/schema/raw/master/csl-citation.json"} </w:instrText>
+      </w:r>
+      <w:r>
+        <w:fldChar w:fldCharType="separate"/>
+      </w:r>
+      <w:r>
+        <w:rPr>
+          <w:rFonts w:ascii="Times New Roman" w:cs="Times New Roman"/>
+          <w:szCs w:val="24"/>
+          <w:vertAlign w:val="superscript"/>
+        </w:rPr>
+        <w:t>4</w:t>
+      </w:r>
+      <w:r>
+        <w:fldChar w:fldCharType="end"/>
+      </w:r>
+      <w:r>
+        <w:t xml:space="preserve"> </w:t>
+      </w:r>
+      <w:r>
+        <w:t xml:space="preserve">Because data were extracted annually and stratified by </w:t>
+      </w:r>
+      <w:r>
+        <w:t>5-year-</w:t>
+      </w:r>
+      <w:r>
+        <w:t>age group and race/ethnicity, some cells corresponding to small population subgroups may not have been reported and therefore are absent from the dataset. Consequently, counts for certain strata may be underestimated.</w:t>
+      </w:r>
+      <w:r>
+        <w:t xml:space="preserve"> </w:t>
+      </w:r>
+      <w:r>
+        <w:t xml:space="preserve"> </w:t>
+      </w:r>
+    </w:p>
+    <w:p>
+      <w:r>
+        <w:t>Annual population estimates by age, sex, race and ethnicity were obtained from the California Department of Finance-Demographic Research Unit (DOF).</w:t>
+      </w:r>
+      <w:r>
+        <w:fldChar w:fldCharType="begin"/>
+      </w:r>
+      <w:r>
+        <w:instrText xml:space="preserve"> ADDIN ZOTERO_ITEM CSL_CITATION {"citationID":"Q7AtsFzI","properties":{"formattedCitation":"\\super 7,8\\nosupersub{}","plainCitation":"7,8","noteIndex":0},"citationItems":[{"id":1629,"uris":["http://zotero.org/groups/5890901/items/QIICLCBB"],"itemData":{"id":1629,"type":"webpage","title":"Annual Intercensal Population Estimates by Race/Ethnicity with Age and Gender Detail 2000–2010 | California Department of Finance","URL":"https://dof.ca.gov/forecasting/demographics/estimates/annual-intercensal-population-estimates-by-race-ethnicity-with-age-and-gender-detail/","accessed":{"date-parts":[["2026",2,19]]}}},{"id":1627,"uris":["http://zotero.org/groups/5890901/items/CI2DVIZH"],"itemData":{"id":1627,"type":"webpage","title":"Annual Intercensal Population Estimates by Race/Ethnicity with Age and Gender Detail 2010-2020 | California Department of Finance","URL":"https://dof.ca.gov/forecasting/demographics/estimates/annual-intercensal-population-estimates-by-race-ethnicity-with-age-and-gender-detail-2010-2020/","accessed":{"date-parts":[["2026",2,19]]}}}],"schema":"https://github.com/citation-style-language/schema/raw/master/csl-citation.json"} </w:instrText>
+      </w:r>
+      <w:r>
+        <w:fldChar w:fldCharType="separate"/>
+      </w:r>
+      <w:r>
+        <w:rPr>
+          <w:rFonts w:ascii="Times New Roman" w:cs="Times New Roman"/>
+          <w:szCs w:val="24"/>
+          <w:vertAlign w:val="superscript"/>
+        </w:rPr>
+        <w:t>7,8</w:t>
+      </w:r>
+      <w:r>
+        <w:fldChar w:fldCharType="end"/>
+      </w:r>
+      <w:r>
+        <w:t xml:space="preserve"> </w:t>
+      </w:r>
+      <w:r>
+        <w:t>These population estimates are based on intercensal demographic projections for 2000-2010</w:t>
+      </w:r>
+      <w:r>
+        <w:fldChar w:fldCharType="begin"/>
+      </w:r>
+      <w:r>
+        <w:instrText xml:space="preserve"> ADDIN ZOTERO_ITEM CSL_CITATION {"citationID":"jaI41rqV","properties":{"formattedCitation":"\\super 7\\nosupersub{}","plainCitation":"7","noteIndex":0},"citationItems":[{"id":1629,"uris":["http://zotero.org/groups/5890901/items/QIICLCBB"],"itemData":{"id":1629,"type":"webpage","title":"Annual Intercensal Population Estimates by Race/Ethnicity with Age and Gender Detail 2000–2010 | California Department of Finance","URL":"https://dof.ca.gov/forecasting/demographics/estimates/annual-intercensal-population-estimates-by-race-ethnicity-with-age-and-gender-detail/","accessed":{"date-parts":[["2026",2,19]]}}}],"schema":"https://github.com/citation-style-language/schema/raw/master/csl-citation.json"} </w:instrText>
+      </w:r>
+      <w:r>
+        <w:fldChar w:fldCharType="separate"/>
+      </w:r>
+      <w:r>
+        <w:rPr>
+          <w:rFonts w:ascii="Times New Roman" w:cs="Times New Roman"/>
+          <w:szCs w:val="24"/>
+          <w:vertAlign w:val="superscript"/>
+        </w:rPr>
+        <w:t>7</w:t>
+      </w:r>
+      <w:r>
+        <w:fldChar w:fldCharType="end"/>
+      </w:r>
+      <w:r>
+        <w:t xml:space="preserve"> and 2010-2020.</w:t>
+      </w:r>
+      <w:r>
+        <w:fldChar w:fldCharType="begin"/>
+      </w:r>
+      <w:r>
+        <w:instrText xml:space="preserve"> ADDIN ZOTERO_ITEM CSL_CITATION {"citationID":"IhUqySzu","properties":{"formattedCitation":"\\super 8\\nosupersub{}","plainCitation":"8","noteIndex":0},"citationItems":[{"id":1627,"uris":["http://zotero.org/groups/5890901/items/CI2DVIZH"],"itemData":{"id":1627,"type":"webpage","title":"Annual Intercensal Population Estimates by Race/Ethnicity with Age and Gender Detail 2010-2020 | California Department of Finance","URL":"https://dof.ca.gov/forecasting/demographics/estimates/annual-intercensal-population-estimates-by-race-ethnicity-with-age-and-gender-detail-2010-2020/","accessed":{"date-parts":[["2026",2,19]]}}}],"schema":"https://github.com/citation-style-language/schema/raw/master/csl-citation.json"} </w:instrText>
+      </w:r>
+      <w:r>
+        <w:fldChar w:fldCharType="separate"/>
+      </w:r>
+      <w:r>
+        <w:rPr>
+          <w:rFonts w:ascii="Times New Roman" w:cs="Times New Roman"/>
+          <w:szCs w:val="24"/>
+          <w:vertAlign w:val="superscript"/>
+        </w:rPr>
+        <w:t>8</w:t>
       </w:r>
       <w:r>
         <w:fldChar w:fldCharType="end"/>
@@ -336,7 +470,7 @@
         <w:fldChar w:fldCharType="begin"/>
       </w:r>
       <w:r>
-        <w:instrText xml:space="preserve"> ADDIN ZOTERO_ITEM CSL_CITATION {"citationID":"8W4uKWL3","properties":{"formattedCitation":"\\super 6\\nosupersub{}","plainCitation":"6","noteIndex":0},"citationItems":[{"id":1625,"uris":["http://zotero.org/groups/5890901/items/22E8J9HX"],"itemData":{"id":1625,"type":"webpage","publisher":"World Health Organization","title":"ICD-10 : international statistical classification of diseases and related health problems : tenth revision, 2nd ed.","URL":"https://iris.who.int/handle/10665/42980","author":[{"family":"World Health Organization","given":""}],"accessed":{"date-parts":[["2026",2,19]]},"issued":{"date-parts":[["2004"]]}}}],"schema":"https://github.com/citation-style-language/schema/raw/master/csl-citation.json"} </w:instrText>
+        <w:instrText xml:space="preserve"> ADDIN ZOTERO_ITEM CSL_CITATION {"citationID":"8W4uKWL3","properties":{"formattedCitation":"\\super 9\\nosupersub{}","plainCitation":"9","noteIndex":0},"citationItems":[{"id":1625,"uris":["http://zotero.org/groups/5890901/items/22E8J9HX"],"itemData":{"id":1625,"type":"webpage","publisher":"World Health Organization","title":"ICD-10 : international statistical classification of diseases and related health problems : tenth revision, 2nd ed.","URL":"https://iris.who.int/handle/10665/42980","author":[{"family":"World Health Organization","given":""}],"accessed":{"date-parts":[["2026",2,19]]},"issued":{"date-parts":[["2004"]]}}}],"schema":"https://github.com/citation-style-language/schema/raw/master/csl-citation.json"} </w:instrText>
       </w:r>
       <w:r>
         <w:fldChar w:fldCharType="separate"/>
@@ -347,7 +481,7 @@
           <w:szCs w:val="24"/>
           <w:vertAlign w:val="superscript"/>
         </w:rPr>
-        <w:t>6</w:t>
+        <w:t>9</w:t>
       </w:r>
       <w:r>
         <w:fldChar w:fldCharType="end"/>
@@ -443,7 +577,7 @@
         <w:fldChar w:fldCharType="begin"/>
       </w:r>
       <w:r>
-        <w:instrText xml:space="preserve"> ADDIN ZOTERO_ITEM CSL_CITATION {"citationID":"JMKm1JsL","properties":{"formattedCitation":"\\super 7\\nosupersub{}","plainCitation":"7","noteIndex":0},"citationItems":[{"id":1621,"uris":["http://zotero.org/groups/5890901/items/FV4EE2QR"],"itemData":{"id":1621,"type":"webpage","title":"The Comprehensive R Archive Network","URL":"https://cran.r-project.org/","author":[{"family":"R Core Team","given":""}],"accessed":{"date-parts":[["2026",2,19]]},"issued":{"date-parts":[["2025"]]}}}],"schema":"https://github.com/citation-style-language/schema/raw/master/csl-citation.json"} </w:instrText>
+        <w:instrText xml:space="preserve"> ADDIN ZOTERO_ITEM CSL_CITATION {"citationID":"JMKm1JsL","properties":{"formattedCitation":"\\super 10\\nosupersub{}","plainCitation":"10","noteIndex":0},"citationItems":[{"id":1621,"uris":["http://zotero.org/groups/5890901/items/FV4EE2QR"],"itemData":{"id":1621,"type":"webpage","title":"The Comprehensive R Archive Network","URL":"https://cran.r-project.org/","author":[{"family":"R Core Team","given":""}],"accessed":{"date-parts":[["2026",2,19]]},"issued":{"date-parts":[["2025"]]}}}],"schema":"https://github.com/citation-style-language/schema/raw/master/csl-citation.json"} </w:instrText>
       </w:r>
       <w:r>
         <w:fldChar w:fldCharType="separate"/>
@@ -454,7 +588,7 @@
           <w:szCs w:val="24"/>
           <w:vertAlign w:val="superscript"/>
         </w:rPr>
-        <w:t>7</w:t>
+        <w:t>10</w:t>
       </w:r>
       <w:r>
         <w:fldChar w:fldCharType="end"/>
@@ -524,6 +658,474 @@
       </w:r>
       <w:r>
         <w:t>Mortality rate ratios for Hispanic males were lower than those for non-Hispanic White males across ages 0–59, ranging from 0.72 to 0.83. In contrast, mortality rate ratios for non-Hispanic Black males exceeded 1.0 across ages 0–84.</w:t>
+      </w:r>
+    </w:p>
+    <w:p>
+      <w:r>
+        <w:t>As shown in figure 2, Hispanic</w:t>
+      </w:r>
+      <w:r>
+        <w:t xml:space="preserve"> females had</w:t>
+      </w:r>
+      <w:r>
+        <w:t xml:space="preserve"> </w:t>
+      </w:r>
+      <w:r>
+        <w:t>lower mortality rates than non-Hispanic white females from age 0-64,</w:t>
+      </w:r>
+      <w:r>
+        <w:t xml:space="preserve"> ranging from 0.61 to 0.97,</w:t>
+      </w:r>
+      <w:r>
+        <w:t xml:space="preserve"> while </w:t>
+      </w:r>
+      <w:r>
+        <w:t xml:space="preserve">mortality rate ratios for </w:t>
+      </w:r>
+      <w:r>
+        <w:t xml:space="preserve">females age 65+ </w:t>
+      </w:r>
+      <w:r>
+        <w:t>increased with age (1.05 to 1.34)</w:t>
+      </w:r>
+      <w:r>
+        <w:t xml:space="preserve">. </w:t>
+      </w:r>
+      <w:r>
+        <w:t>Non-Hispanic black females, in contrast, had</w:t>
+      </w:r>
+    </w:p>
+    <w:p/>
+    <w:p>
+      <w:pPr>
+        <w:pStyle w:val="Heading1"/>
+      </w:pPr>
+      <w:r>
+        <w:t xml:space="preserve">Discussion </w:t>
+      </w:r>
+      <w:r>
+        <w:t xml:space="preserve"> </w:t>
+      </w:r>
+    </w:p>
+    <w:p/>
+    <w:p>
+      <w:pPr>
+        <w:pStyle w:val="Heading2"/>
+      </w:pPr>
+      <w:r>
+        <w:t xml:space="preserve">Limitations </w:t>
+      </w:r>
+    </w:p>
+    <w:p>
+      <w:pPr>
+        <w:pStyle w:val="ListParagraph"/>
+        <w:numPr>
+          <w:ilvl w:val="0"/>
+          <w:numId w:val="1"/>
+        </w:numPr>
+      </w:pPr>
+      <w:r>
+        <w:t xml:space="preserve">Undercounting of cells </w:t>
+      </w:r>
+    </w:p>
+    <w:p/>
+    <w:p>
+      <w:pPr>
+        <w:pStyle w:val="Heading1"/>
+      </w:pPr>
+      <w:r>
+        <w:lastRenderedPageBreak/>
+        <w:t xml:space="preserve">References </w:t>
+      </w:r>
+    </w:p>
+    <w:p>
+      <w:pPr>
+        <w:pStyle w:val="Bibliography"/>
+        <w:rPr>
+          <w:rFonts w:ascii="Times New Roman" w:cs="Times New Roman"/>
+        </w:rPr>
+      </w:pPr>
+      <w:r>
+        <w:fldChar w:fldCharType="begin"/>
+      </w:r>
+      <w:r>
+        <w:instrText xml:space="preserve"> ADDIN ZOTERO_BIBL {"uncited":[],"omitted":[],"custom":[]} CSL_BIBLIOGRAPHY </w:instrText>
+      </w:r>
+      <w:r>
+        <w:fldChar w:fldCharType="separate"/>
+      </w:r>
+      <w:r>
+        <w:rPr>
+          <w:rFonts w:ascii="Times New Roman" w:cs="Times New Roman"/>
+        </w:rPr>
+        <w:t>1.</w:t>
+      </w:r>
+      <w:r>
+        <w:rPr>
+          <w:rFonts w:ascii="Times New Roman" w:cs="Times New Roman"/>
+        </w:rPr>
+        <w:tab/>
+        <w:t xml:space="preserve">Hayes-Bautista DE, Hsu P, Hayes-Bautista M, et al. An anomaly within the Latino epidemiological paradox: the Latino adolescent male mortality peak. </w:t>
+      </w:r>
+      <w:r>
+        <w:rPr>
+          <w:rFonts w:ascii="Times New Roman" w:cs="Times New Roman"/>
+          <w:i/>
+          <w:iCs/>
+        </w:rPr>
+        <w:t xml:space="preserve">Arch </w:t>
+      </w:r>
+      <w:proofErr w:type="spellStart"/>
+      <w:r>
+        <w:rPr>
+          <w:rFonts w:ascii="Times New Roman" w:cs="Times New Roman"/>
+          <w:i/>
+          <w:iCs/>
+        </w:rPr>
+        <w:t>Pediatr</w:t>
+      </w:r>
+      <w:proofErr w:type="spellEnd"/>
+      <w:r>
+        <w:rPr>
+          <w:rFonts w:ascii="Times New Roman" w:cs="Times New Roman"/>
+          <w:i/>
+          <w:iCs/>
+        </w:rPr>
+        <w:t xml:space="preserve"> </w:t>
+      </w:r>
+      <w:proofErr w:type="spellStart"/>
+      <w:r>
+        <w:rPr>
+          <w:rFonts w:ascii="Times New Roman" w:cs="Times New Roman"/>
+          <w:i/>
+          <w:iCs/>
+        </w:rPr>
+        <w:t>Adolesc</w:t>
+      </w:r>
+      <w:proofErr w:type="spellEnd"/>
+      <w:r>
+        <w:rPr>
+          <w:rFonts w:ascii="Times New Roman" w:cs="Times New Roman"/>
+          <w:i/>
+          <w:iCs/>
+        </w:rPr>
+        <w:t xml:space="preserve"> Med</w:t>
+      </w:r>
+      <w:r>
+        <w:rPr>
+          <w:rFonts w:ascii="Times New Roman" w:cs="Times New Roman"/>
+        </w:rPr>
+        <w:t>. 2002;156(5):480-484. doi:10.1001/archpedi.156.5.480</w:t>
+      </w:r>
+    </w:p>
+    <w:p>
+      <w:pPr>
+        <w:pStyle w:val="Bibliography"/>
+        <w:rPr>
+          <w:rFonts w:ascii="Times New Roman" w:cs="Times New Roman"/>
+        </w:rPr>
+      </w:pPr>
+      <w:r>
+        <w:rPr>
+          <w:rFonts w:ascii="Times New Roman" w:cs="Times New Roman"/>
+        </w:rPr>
+        <w:t>2.</w:t>
+      </w:r>
+      <w:r>
+        <w:rPr>
+          <w:rFonts w:ascii="Times New Roman" w:cs="Times New Roman"/>
+        </w:rPr>
+        <w:tab/>
+        <w:t xml:space="preserve">Markides KS, Coreil J. The health of Hispanics in the southwestern United States: an epidemiologic paradox. </w:t>
+      </w:r>
+      <w:r>
+        <w:rPr>
+          <w:rFonts w:ascii="Times New Roman" w:cs="Times New Roman"/>
+          <w:i/>
+          <w:iCs/>
+        </w:rPr>
+        <w:t>Public Health Rep</w:t>
+      </w:r>
+      <w:r>
+        <w:rPr>
+          <w:rFonts w:ascii="Times New Roman" w:cs="Times New Roman"/>
+        </w:rPr>
+        <w:t>. 1986;101(3):253-265.</w:t>
+      </w:r>
+    </w:p>
+    <w:p>
+      <w:pPr>
+        <w:pStyle w:val="Bibliography"/>
+        <w:rPr>
+          <w:rFonts w:ascii="Times New Roman" w:cs="Times New Roman"/>
+        </w:rPr>
+      </w:pPr>
+      <w:r>
+        <w:rPr>
+          <w:rFonts w:ascii="Times New Roman" w:cs="Times New Roman"/>
+        </w:rPr>
+        <w:t>3.</w:t>
+      </w:r>
+      <w:r>
+        <w:rPr>
+          <w:rFonts w:ascii="Times New Roman" w:cs="Times New Roman"/>
+        </w:rPr>
+        <w:tab/>
+        <w:t xml:space="preserve">Vaca FE, Anderson CL, Hayes-Bautista DE. THE LATINO ADOLESCENT MALE MORTALITY PEAK REVISITED: ATTRIBUTION OF HOMICIDE AND MOTOR VEHICLE CRASH FATALITY. </w:t>
+      </w:r>
+      <w:proofErr w:type="spellStart"/>
+      <w:r>
+        <w:rPr>
+          <w:rFonts w:ascii="Times New Roman" w:cs="Times New Roman"/>
+          <w:i/>
+          <w:iCs/>
+        </w:rPr>
+        <w:t>Inj</w:t>
+      </w:r>
+      <w:proofErr w:type="spellEnd"/>
+      <w:r>
+        <w:rPr>
+          <w:rFonts w:ascii="Times New Roman" w:cs="Times New Roman"/>
+          <w:i/>
+          <w:iCs/>
+        </w:rPr>
+        <w:t xml:space="preserve"> Prev J Int Soc Child </w:t>
+      </w:r>
+      <w:proofErr w:type="spellStart"/>
+      <w:r>
+        <w:rPr>
+          <w:rFonts w:ascii="Times New Roman" w:cs="Times New Roman"/>
+          <w:i/>
+          <w:iCs/>
+        </w:rPr>
+        <w:t>Adolesc</w:t>
+      </w:r>
+      <w:proofErr w:type="spellEnd"/>
+      <w:r>
+        <w:rPr>
+          <w:rFonts w:ascii="Times New Roman" w:cs="Times New Roman"/>
+          <w:i/>
+          <w:iCs/>
+        </w:rPr>
+        <w:t xml:space="preserve"> </w:t>
+      </w:r>
+      <w:proofErr w:type="spellStart"/>
+      <w:r>
+        <w:rPr>
+          <w:rFonts w:ascii="Times New Roman" w:cs="Times New Roman"/>
+          <w:i/>
+          <w:iCs/>
+        </w:rPr>
+        <w:t>Inj</w:t>
+      </w:r>
+      <w:proofErr w:type="spellEnd"/>
+      <w:r>
+        <w:rPr>
+          <w:rFonts w:ascii="Times New Roman" w:cs="Times New Roman"/>
+          <w:i/>
+          <w:iCs/>
+        </w:rPr>
+        <w:t xml:space="preserve"> Prev</w:t>
+      </w:r>
+      <w:r>
+        <w:rPr>
+          <w:rFonts w:ascii="Times New Roman" w:cs="Times New Roman"/>
+        </w:rPr>
+        <w:t>. 2011;17(2):102-107. doi:10.1136/ip.2010.028886</w:t>
+      </w:r>
+    </w:p>
+    <w:p>
+      <w:pPr>
+        <w:pStyle w:val="Bibliography"/>
+        <w:rPr>
+          <w:rFonts w:ascii="Times New Roman" w:cs="Times New Roman"/>
+        </w:rPr>
+      </w:pPr>
+      <w:r>
+        <w:rPr>
+          <w:rFonts w:ascii="Times New Roman" w:cs="Times New Roman"/>
+        </w:rPr>
+        <w:t>4.</w:t>
+      </w:r>
+      <w:r>
+        <w:rPr>
+          <w:rFonts w:ascii="Times New Roman" w:cs="Times New Roman"/>
+        </w:rPr>
+        <w:tab/>
+        <w:t>National Center for Health Statistics (NCHS). Multiple Cause of Death 1999-2020 on CDC WONDER Online Database. Published online 2021. Accessed January 28, 2026. http://wonder.cdc.gov/mcd-icd10.html</w:t>
+      </w:r>
+    </w:p>
+    <w:p>
+      <w:pPr>
+        <w:pStyle w:val="Bibliography"/>
+        <w:rPr>
+          <w:rFonts w:ascii="Times New Roman" w:cs="Times New Roman"/>
+        </w:rPr>
+      </w:pPr>
+      <w:r>
+        <w:rPr>
+          <w:rFonts w:ascii="Times New Roman" w:cs="Times New Roman"/>
+        </w:rPr>
+        <w:t>5.</w:t>
+      </w:r>
+      <w:r>
+        <w:rPr>
+          <w:rFonts w:ascii="Times New Roman" w:cs="Times New Roman"/>
+        </w:rPr>
+        <w:tab/>
+        <w:t>National Center for Health Statistics (NCHS). Race. June 6, 2025. Accessed February 20, 2026. https://www.cdc.gov/nchs/hus/sources-definitions/race.html</w:t>
+      </w:r>
+    </w:p>
+    <w:p>
+      <w:pPr>
+        <w:pStyle w:val="Bibliography"/>
+        <w:rPr>
+          <w:rFonts w:ascii="Times New Roman" w:cs="Times New Roman"/>
+        </w:rPr>
+      </w:pPr>
+      <w:r>
+        <w:rPr>
+          <w:rFonts w:ascii="Times New Roman" w:cs="Times New Roman"/>
+        </w:rPr>
+        <w:t>6.</w:t>
+      </w:r>
+      <w:r>
+        <w:rPr>
+          <w:rFonts w:ascii="Times New Roman" w:cs="Times New Roman"/>
+        </w:rPr>
+        <w:tab/>
+        <w:t>Bureau UC. Hispanic or Latino Origin. Census.gov. Accessed February 20, 2026. https://www.census.gov/programs-surveys/acs/</w:t>
+      </w:r>
+    </w:p>
+    <w:p>
+      <w:pPr>
+        <w:pStyle w:val="Bibliography"/>
+        <w:rPr>
+          <w:rFonts w:ascii="Times New Roman" w:cs="Times New Roman"/>
+        </w:rPr>
+      </w:pPr>
+      <w:r>
+        <w:rPr>
+          <w:rFonts w:ascii="Times New Roman" w:cs="Times New Roman"/>
+        </w:rPr>
+        <w:t>7.</w:t>
+      </w:r>
+      <w:r>
+        <w:rPr>
+          <w:rFonts w:ascii="Times New Roman" w:cs="Times New Roman"/>
+        </w:rPr>
+        <w:tab/>
+        <w:t>Annual Intercensal Population Estimates by Race/Ethnicity with Age and Gender Detail 2000–2010 | California Department of Finance. Accessed February 19, 2026. https://dof.ca.gov/forecasting/demographics/estimates/annual-intercensal-population-estimates-by-race-ethnicity-with-age-and-gender-detail/</w:t>
+      </w:r>
+    </w:p>
+    <w:p>
+      <w:pPr>
+        <w:pStyle w:val="Bibliography"/>
+        <w:rPr>
+          <w:rFonts w:ascii="Times New Roman" w:cs="Times New Roman"/>
+        </w:rPr>
+      </w:pPr>
+      <w:r>
+        <w:rPr>
+          <w:rFonts w:ascii="Times New Roman" w:cs="Times New Roman"/>
+        </w:rPr>
+        <w:t>8.</w:t>
+      </w:r>
+      <w:r>
+        <w:rPr>
+          <w:rFonts w:ascii="Times New Roman" w:cs="Times New Roman"/>
+        </w:rPr>
+        <w:tab/>
+        <w:t>Annual Intercensal Population Estimates by Race/Ethnicity with Age and Gender Detail 2010-2020 | California Department of Finance. Accessed February 19, 2026. https://dof.ca.gov/forecasting/demographics/estimates/annual-intercensal-population-estimates-by-race-ethnicity-with-age-and-gender-detail-2010-2020/</w:t>
+      </w:r>
+    </w:p>
+    <w:p>
+      <w:pPr>
+        <w:pStyle w:val="Bibliography"/>
+        <w:rPr>
+          <w:rFonts w:ascii="Times New Roman" w:cs="Times New Roman"/>
+        </w:rPr>
+      </w:pPr>
+      <w:r>
+        <w:rPr>
+          <w:rFonts w:ascii="Times New Roman" w:cs="Times New Roman"/>
+        </w:rPr>
+        <w:t>9.</w:t>
+      </w:r>
+      <w:r>
+        <w:rPr>
+          <w:rFonts w:ascii="Times New Roman" w:cs="Times New Roman"/>
+        </w:rPr>
+        <w:tab/>
+        <w:t>World Health Organization. ICD-</w:t>
+      </w:r>
+      <w:proofErr w:type="gramStart"/>
+      <w:r>
+        <w:rPr>
+          <w:rFonts w:ascii="Times New Roman" w:cs="Times New Roman"/>
+        </w:rPr>
+        <w:t>10 :</w:t>
+      </w:r>
+      <w:proofErr w:type="gramEnd"/>
+      <w:r>
+        <w:rPr>
+          <w:rFonts w:ascii="Times New Roman" w:cs="Times New Roman"/>
+        </w:rPr>
+        <w:t xml:space="preserve"> international statistical classification of diseases and related health </w:t>
+      </w:r>
+      <w:proofErr w:type="gramStart"/>
+      <w:r>
+        <w:rPr>
+          <w:rFonts w:ascii="Times New Roman" w:cs="Times New Roman"/>
+        </w:rPr>
+        <w:t>problems :</w:t>
+      </w:r>
+      <w:proofErr w:type="gramEnd"/>
+      <w:r>
+        <w:rPr>
+          <w:rFonts w:ascii="Times New Roman" w:cs="Times New Roman"/>
+        </w:rPr>
+        <w:t xml:space="preserve"> tenth revision, 2nd ed. 2004. Accessed February 19, 2026. https://iris.who.int/handle/10665/42980</w:t>
+      </w:r>
+    </w:p>
+    <w:p>
+      <w:pPr>
+        <w:pStyle w:val="Bibliography"/>
+        <w:rPr>
+          <w:rFonts w:ascii="Times New Roman" w:cs="Times New Roman"/>
+        </w:rPr>
+      </w:pPr>
+      <w:r>
+        <w:rPr>
+          <w:rFonts w:ascii="Times New Roman" w:cs="Times New Roman"/>
+        </w:rPr>
+        <w:t>10.</w:t>
+      </w:r>
+      <w:r>
+        <w:rPr>
+          <w:rFonts w:ascii="Times New Roman" w:cs="Times New Roman"/>
+        </w:rPr>
+        <w:tab/>
+        <w:t>R Core Team. The Comprehensive R Archive Network. 2025. Accessed February 19, 2026. https://cran.r-project.org/</w:t>
+      </w:r>
+    </w:p>
+    <w:p>
+      <w:pPr>
+        <w:pStyle w:val="Bibliography"/>
+      </w:pPr>
+      <w:r>
+        <w:fldChar w:fldCharType="end"/>
+      </w:r>
+    </w:p>
+    <w:p>
+      <w:pPr>
+        <w:pStyle w:val="Heading1"/>
+      </w:pPr>
+      <w:r>
+        <w:t>Figures and Tables</w:t>
+      </w:r>
+      <w:r>
+        <w:t xml:space="preserve">  </w:t>
       </w:r>
     </w:p>
     <w:p>
@@ -546,6 +1148,7 @@
         <w:t xml:space="preserve"> age groups with 95% CI, California, 2007-2020.</w:t>
       </w:r>
     </w:p>
+    <w:p/>
     <w:p>
       <w:r>
         <w:rPr>
@@ -553,7 +1156,7 @@
         </w:rPr>
         <w:lastRenderedPageBreak/>
         <w:drawing>
-          <wp:inline distT="0" distB="0" distL="0" distR="0" wp14:anchorId="3C5485D6" wp14:editId="04DC5C58">
+          <wp:inline distT="0" distB="0" distL="0" distR="0" wp14:anchorId="1482D5DE" wp14:editId="7A5353F3">
             <wp:extent cx="3165114" cy="2215918"/>
             <wp:effectExtent l="0" t="0" r="0" b="0"/>
             <wp:docPr id="731573635" name="Picture 2" descr="A graph with red lines and blue lines&#10;&#10;AI-generated content may be incorrect."/>
@@ -607,11 +1210,6 @@
     </w:p>
     <w:p>
       <w:r>
-        <w:t xml:space="preserve">As shown in figure 2, female Hispanics had mortality rate ratios </w:t>
-      </w:r>
-    </w:p>
-    <w:p>
-      <w:r>
         <w:rPr>
           <w:b/>
           <w:bCs/>
@@ -619,10 +1217,7 @@
         <w:t>Figure 2.</w:t>
       </w:r>
       <w:r>
-        <w:t xml:space="preserve"> </w:t>
-      </w:r>
-      <w:r>
-        <w:t xml:space="preserve">Female </w:t>
+        <w:t xml:space="preserve"> Female </w:t>
       </w:r>
       <w:proofErr w:type="spellStart"/>
       <w:r>
@@ -641,13 +1236,14 @@
         <w:t xml:space="preserve"> age groups with 95% CI, California, 2007-2020.</w:t>
       </w:r>
     </w:p>
+    <w:p/>
     <w:p>
       <w:r>
         <w:rPr>
           <w:noProof/>
         </w:rPr>
         <w:drawing>
-          <wp:inline distT="0" distB="0" distL="0" distR="0" wp14:anchorId="77C7BAE2" wp14:editId="6ACECDA4">
+          <wp:inline distT="0" distB="0" distL="0" distR="0" wp14:anchorId="68ADFFF9" wp14:editId="7641F096">
             <wp:extent cx="3557483" cy="2490619"/>
             <wp:effectExtent l="0" t="0" r="0" b="0"/>
             <wp:docPr id="2017094560" name="Picture 6" descr="A graph of a number of people&#10;&#10;AI-generated content may be incorrect."/>
@@ -694,236 +1290,6 @@
             </a:graphic>
           </wp:inline>
         </w:drawing>
-      </w:r>
-    </w:p>
-    <w:p>
-      <w:pPr>
-        <w:pStyle w:val="Heading1"/>
-      </w:pPr>
-      <w:r>
-        <w:t xml:space="preserve">Discussion </w:t>
-      </w:r>
-    </w:p>
-    <w:p>
-      <w:pPr>
-        <w:pStyle w:val="Heading2"/>
-      </w:pPr>
-      <w:r>
-        <w:t xml:space="preserve">Limitations </w:t>
-      </w:r>
-    </w:p>
-    <w:p>
-      <w:pPr>
-        <w:pStyle w:val="ListParagraph"/>
-        <w:numPr>
-          <w:ilvl w:val="0"/>
-          <w:numId w:val="1"/>
-        </w:numPr>
-      </w:pPr>
-      <w:r>
-        <w:t xml:space="preserve">Undercounting of cells </w:t>
-      </w:r>
-    </w:p>
-    <w:p/>
-    <w:p>
-      <w:pPr>
-        <w:pStyle w:val="Heading1"/>
-      </w:pPr>
-      <w:r>
-        <w:t xml:space="preserve">References </w:t>
-      </w:r>
-    </w:p>
-    <w:p>
-      <w:pPr>
-        <w:pStyle w:val="Bibliography"/>
-        <w:rPr>
-          <w:rFonts w:ascii="Times New Roman" w:cs="Times New Roman"/>
-        </w:rPr>
-      </w:pPr>
-      <w:r>
-        <w:fldChar w:fldCharType="begin"/>
-      </w:r>
-      <w:r>
-        <w:instrText xml:space="preserve"> ADDIN ZOTERO_BIBL {"uncited":[],"omitted":[],"custom":[]} CSL_BIBLIOGRAPHY </w:instrText>
-      </w:r>
-      <w:r>
-        <w:fldChar w:fldCharType="separate"/>
-      </w:r>
-      <w:r>
-        <w:rPr>
-          <w:rFonts w:ascii="Times New Roman" w:cs="Times New Roman"/>
-        </w:rPr>
-        <w:t>1.</w:t>
-      </w:r>
-      <w:r>
-        <w:rPr>
-          <w:rFonts w:ascii="Times New Roman" w:cs="Times New Roman"/>
-        </w:rPr>
-        <w:tab/>
-        <w:t>National Center for Health Statistics (NCHS). Multiple Cause of Death 1999-2020 on CDC WONDER Online Database. Published online 2021. Accessed January 28, 2026. http://wonder.cdc.gov/mcd-icd10.html</w:t>
-      </w:r>
-    </w:p>
-    <w:p>
-      <w:pPr>
-        <w:pStyle w:val="Bibliography"/>
-        <w:rPr>
-          <w:rFonts w:ascii="Times New Roman" w:cs="Times New Roman"/>
-        </w:rPr>
-      </w:pPr>
-      <w:r>
-        <w:rPr>
-          <w:rFonts w:ascii="Times New Roman" w:cs="Times New Roman"/>
-        </w:rPr>
-        <w:lastRenderedPageBreak/>
-        <w:t>2.</w:t>
-      </w:r>
-      <w:r>
-        <w:rPr>
-          <w:rFonts w:ascii="Times New Roman" w:cs="Times New Roman"/>
-        </w:rPr>
-        <w:tab/>
-        <w:t>National Center for Health Statistics (NCHS). Race. June 6, 2025. Accessed February 20, 2026. https://www.cdc.gov/nchs/hus/sources-definitions/race.html</w:t>
-      </w:r>
-    </w:p>
-    <w:p>
-      <w:pPr>
-        <w:pStyle w:val="Bibliography"/>
-        <w:rPr>
-          <w:rFonts w:ascii="Times New Roman" w:cs="Times New Roman"/>
-        </w:rPr>
-      </w:pPr>
-      <w:r>
-        <w:rPr>
-          <w:rFonts w:ascii="Times New Roman" w:cs="Times New Roman"/>
-        </w:rPr>
-        <w:t>3.</w:t>
-      </w:r>
-      <w:r>
-        <w:rPr>
-          <w:rFonts w:ascii="Times New Roman" w:cs="Times New Roman"/>
-        </w:rPr>
-        <w:tab/>
-        <w:t>Bureau UC. Hispanic or Latino Origin. Census.gov. Accessed February 20, 2026. https://www.census.gov/programs-surveys/acs/</w:t>
-      </w:r>
-    </w:p>
-    <w:p>
-      <w:pPr>
-        <w:pStyle w:val="Bibliography"/>
-        <w:rPr>
-          <w:rFonts w:ascii="Times New Roman" w:cs="Times New Roman"/>
-        </w:rPr>
-      </w:pPr>
-      <w:r>
-        <w:rPr>
-          <w:rFonts w:ascii="Times New Roman" w:cs="Times New Roman"/>
-        </w:rPr>
-        <w:t>4.</w:t>
-      </w:r>
-      <w:r>
-        <w:rPr>
-          <w:rFonts w:ascii="Times New Roman" w:cs="Times New Roman"/>
-        </w:rPr>
-        <w:tab/>
-        <w:t>Annual Intercensal Population Estimates by Race/Ethnicity with Age and Gender Detail 2000–2010 | California Department of Finance. Accessed February 19, 2026. https://dof.ca.gov/forecasting/demographics/estimates/annual-intercensal-population-estimates-by-race-ethnicity-with-age-and-gender-detail/</w:t>
-      </w:r>
-    </w:p>
-    <w:p>
-      <w:pPr>
-        <w:pStyle w:val="Bibliography"/>
-        <w:rPr>
-          <w:rFonts w:ascii="Times New Roman" w:cs="Times New Roman"/>
-        </w:rPr>
-      </w:pPr>
-      <w:r>
-        <w:rPr>
-          <w:rFonts w:ascii="Times New Roman" w:cs="Times New Roman"/>
-        </w:rPr>
-        <w:t>5.</w:t>
-      </w:r>
-      <w:r>
-        <w:rPr>
-          <w:rFonts w:ascii="Times New Roman" w:cs="Times New Roman"/>
-        </w:rPr>
-        <w:tab/>
-        <w:t>Annual Intercensal Population Estimates by Race/Ethnicity with Age and Gender Detail 2010-2020 | California Department of Finance. Accessed February 19, 2026. https://dof.ca.gov/forecasting/demographics/estimates/annual-intercensal-population-estimates-by-race-ethnicity-with-age-and-gender-detail-2010-2020/</w:t>
-      </w:r>
-    </w:p>
-    <w:p>
-      <w:pPr>
-        <w:pStyle w:val="Bibliography"/>
-        <w:rPr>
-          <w:rFonts w:ascii="Times New Roman" w:cs="Times New Roman"/>
-        </w:rPr>
-      </w:pPr>
-      <w:r>
-        <w:rPr>
-          <w:rFonts w:ascii="Times New Roman" w:cs="Times New Roman"/>
-        </w:rPr>
-        <w:t>6.</w:t>
-      </w:r>
-      <w:r>
-        <w:rPr>
-          <w:rFonts w:ascii="Times New Roman" w:cs="Times New Roman"/>
-        </w:rPr>
-        <w:tab/>
-        <w:t>World Health Organization. ICD-</w:t>
-      </w:r>
-      <w:proofErr w:type="gramStart"/>
-      <w:r>
-        <w:rPr>
-          <w:rFonts w:ascii="Times New Roman" w:cs="Times New Roman"/>
-        </w:rPr>
-        <w:t>10 :</w:t>
-      </w:r>
-      <w:proofErr w:type="gramEnd"/>
-      <w:r>
-        <w:rPr>
-          <w:rFonts w:ascii="Times New Roman" w:cs="Times New Roman"/>
-        </w:rPr>
-        <w:t xml:space="preserve"> international statistical classification of diseases and related health </w:t>
-      </w:r>
-      <w:proofErr w:type="gramStart"/>
-      <w:r>
-        <w:rPr>
-          <w:rFonts w:ascii="Times New Roman" w:cs="Times New Roman"/>
-        </w:rPr>
-        <w:t>problems :</w:t>
-      </w:r>
-      <w:proofErr w:type="gramEnd"/>
-      <w:r>
-        <w:rPr>
-          <w:rFonts w:ascii="Times New Roman" w:cs="Times New Roman"/>
-        </w:rPr>
-        <w:t xml:space="preserve"> tenth revision, 2nd ed. 2004. Accessed February 19, 2026. https://iris.who.int/handle/10665/42980</w:t>
-      </w:r>
-    </w:p>
-    <w:p>
-      <w:pPr>
-        <w:pStyle w:val="Bibliography"/>
-        <w:rPr>
-          <w:rFonts w:ascii="Times New Roman" w:cs="Times New Roman"/>
-        </w:rPr>
-      </w:pPr>
-      <w:r>
-        <w:rPr>
-          <w:rFonts w:ascii="Times New Roman" w:cs="Times New Roman"/>
-        </w:rPr>
-        <w:t>7.</w:t>
-      </w:r>
-      <w:r>
-        <w:rPr>
-          <w:rFonts w:ascii="Times New Roman" w:cs="Times New Roman"/>
-        </w:rPr>
-        <w:tab/>
-        <w:t>R Core Team. The Comprehensive R Archive Network. 2025. Accessed February 19, 2026. https://cran.r-project.org/</w:t>
-      </w:r>
-    </w:p>
-    <w:p>
-      <w:pPr>
-        <w:pStyle w:val="Bibliography"/>
-      </w:pPr>
-      <w:r>
-        <w:fldChar w:fldCharType="end"/>
       </w:r>
     </w:p>
     <w:sectPr>
@@ -1571,17 +1937,13 @@
     <w:link w:val="Heading1Char"/>
     <w:uiPriority w:val="9"/>
     <w:qFormat/>
-    <w:rsid w:val="00331788"/>
+    <w:rsid w:val="002C437B"/>
     <w:pPr>
-      <w:spacing w:before="480" w:after="0"/>
-      <w:contextualSpacing/>
       <w:outlineLvl w:val="0"/>
     </w:pPr>
     <w:rPr>
-      <w:smallCaps/>
-      <w:spacing w:val="5"/>
-      <w:sz w:val="36"/>
-      <w:szCs w:val="36"/>
+      <w:sz w:val="24"/>
+      <w:szCs w:val="24"/>
     </w:rPr>
   </w:style>
   <w:style w:type="paragraph" w:styleId="Heading2">
@@ -1833,12 +2195,10 @@
     <w:basedOn w:val="DefaultParagraphFont"/>
     <w:link w:val="Heading1"/>
     <w:uiPriority w:val="9"/>
-    <w:rsid w:val="00331788"/>
-    <w:rPr>
-      <w:smallCaps/>
-      <w:spacing w:val="5"/>
-      <w:sz w:val="36"/>
-      <w:szCs w:val="36"/>
+    <w:rsid w:val="002C437B"/>
+    <w:rPr>
+      <w:sz w:val="24"/>
+      <w:szCs w:val="24"/>
     </w:rPr>
   </w:style>
   <w:style w:type="character" w:customStyle="1" w:styleId="Heading2Char">

</xml_diff>